<commit_message>
Feat: Agente Redactor (cv_rewriter), copia a Descargas y fixes en humanizar
</commit_message>
<xml_diff>
--- a/CV_2026_CesarLopezMoyao.docx
+++ b/CV_2026_CesarLopezMoyao.docx
@@ -33,7 +33,7 @@
           <w:sz w:val="28"/>
           <w:szCs w:val="28"/>
         </w:rPr>
-        <w:t>Data Scientist | Spatial Data Analysis | Computer Vision</w:t>
+        <w:t xml:space="preserve">Data Scientist | </w:t>
       </w:r>
       <w:r>
         <w:rPr>
@@ -42,7 +42,7 @@
           <w:sz w:val="28"/>
           <w:szCs w:val="28"/>
         </w:rPr>
-        <w:t xml:space="preserve"> </w:t>
+        <w:t>Data Analysis |</w:t>
       </w:r>
       <w:r>
         <w:rPr>
@@ -51,7 +51,52 @@
           <w:sz w:val="28"/>
           <w:szCs w:val="28"/>
         </w:rPr>
-        <w:t xml:space="preserve">| Geospatial </w:t>
+        <w:t xml:space="preserve">Data </w:t>
+      </w:r>
+      <w:r>
+        <w:rPr>
+          <w:rFonts w:ascii="Franklin Gothic Book" w:hAnsi="Franklin Gothic Book"/>
+          <w:b/>
+          <w:sz w:val="28"/>
+          <w:szCs w:val="28"/>
+        </w:rPr>
+        <w:t>Engineering</w:t>
+      </w:r>
+      <w:r>
+        <w:rPr>
+          <w:rFonts w:ascii="Franklin Gothic Book" w:hAnsi="Franklin Gothic Book"/>
+          <w:b/>
+          <w:sz w:val="28"/>
+          <w:szCs w:val="28"/>
+        </w:rPr>
+        <w:t xml:space="preserve"> | Computer Vision </w:t>
+      </w:r>
+      <w:r>
+        <w:rPr>
+          <w:rFonts w:ascii="Franklin Gothic Book" w:hAnsi="Franklin Gothic Book"/>
+          <w:b/>
+          <w:sz w:val="28"/>
+          <w:szCs w:val="28"/>
+        </w:rPr>
+        <w:t xml:space="preserve">| </w:t>
+      </w:r>
+      <w:r>
+        <w:rPr>
+          <w:rFonts w:ascii="Franklin Gothic Book" w:hAnsi="Franklin Gothic Book"/>
+          <w:b/>
+          <w:sz w:val="28"/>
+          <w:szCs w:val="28"/>
+        </w:rPr>
+        <w:t>Spatial</w:t>
+      </w:r>
+      <w:r>
+        <w:rPr>
+          <w:rFonts w:ascii="Franklin Gothic Book" w:hAnsi="Franklin Gothic Book"/>
+          <w:b/>
+          <w:sz w:val="28"/>
+          <w:szCs w:val="28"/>
+        </w:rPr>
+        <w:t xml:space="preserve"> </w:t>
       </w:r>
       <w:r>
         <w:rPr>
@@ -67,8 +112,8 @@
     <w:p>
       <w:pPr>
         <w:pStyle w:val="Textoindependiente"/>
-        <w:spacing w:line="249" w:lineRule="auto"/>
-        <w:ind w:left="200" w:firstLine="0"/>
+        <w:spacing w:before="27"/>
+        <w:ind w:left="0" w:firstLine="0"/>
         <w:jc w:val="center"/>
         <w:rPr>
           <w:rFonts w:ascii="Franklin Gothic Book" w:hAnsi="Franklin Gothic Book"/>
@@ -82,7 +127,43 @@
           <w:sz w:val="24"/>
           <w:szCs w:val="24"/>
         </w:rPr>
-        <w:t xml:space="preserve">Experienced Geospatial Data Scientist &amp; GIS Solutions Specialist with over 8 years' tenure. Demonstrated proficiency in remote sensing, raster modeling, spatial analysis, automation, and geospatial data engineering, applied to environmental, territorial, and operational projects. Strong foundation in open-source GIS tools such as QGIS, PostGIS, and Python, bolstered by expertise in ArcGIS Pro, ArcGIS Online, and ArcPy. Transitioned from desktop GIS and EO workflows to reproducible Python pipelines, web GIS, and </w:t>
+        <w:t xml:space="preserve">Experienced Geospatial Data Scientist &amp; GIS Solutions Specialist with over 8 years' experience. Proven expertise in remote sensing, raster modeling, spatial analysis, automation, and geospatial data engineering, applied to environmental, territorial, and operational projects. Strong foundation in open-source GIS tools such as QGIS, </w:t>
+      </w:r>
+      <w:proofErr w:type="spellStart"/>
+      <w:r>
+        <w:rPr>
+          <w:rFonts w:ascii="Franklin Gothic Book" w:hAnsi="Franklin Gothic Book"/>
+          <w:sz w:val="24"/>
+          <w:szCs w:val="24"/>
+        </w:rPr>
+        <w:t>PostGIS</w:t>
+      </w:r>
+      <w:proofErr w:type="spellEnd"/>
+      <w:r>
+        <w:rPr>
+          <w:rFonts w:ascii="Franklin Gothic Book" w:hAnsi="Franklin Gothic Book"/>
+          <w:sz w:val="24"/>
+          <w:szCs w:val="24"/>
+        </w:rPr>
+        <w:t xml:space="preserve">, and Python, complemented by proficiency in ArcGIS Pro, ArcGIS Online, and </w:t>
+      </w:r>
+      <w:proofErr w:type="spellStart"/>
+      <w:r>
+        <w:rPr>
+          <w:rFonts w:ascii="Franklin Gothic Book" w:hAnsi="Franklin Gothic Book"/>
+          <w:sz w:val="24"/>
+          <w:szCs w:val="24"/>
+        </w:rPr>
+        <w:t>ArcPy</w:t>
+      </w:r>
+      <w:proofErr w:type="spellEnd"/>
+      <w:r>
+        <w:rPr>
+          <w:rFonts w:ascii="Franklin Gothic Book" w:hAnsi="Franklin Gothic Book"/>
+          <w:sz w:val="24"/>
+          <w:szCs w:val="24"/>
+        </w:rPr>
+        <w:t xml:space="preserve">. Transitioned desktop GIS and EO workflows to reproducible Python pipelines, web GIS, and </w:t>
       </w:r>
       <w:proofErr w:type="spellStart"/>
       <w:r>
@@ -108,6 +189,7 @@
         <w:pStyle w:val="Textoindependiente"/>
         <w:spacing w:before="27"/>
         <w:ind w:left="0" w:firstLine="0"/>
+        <w:jc w:val="center"/>
         <w:rPr>
           <w:rFonts w:ascii="Franklin Gothic Book" w:hAnsi="Franklin Gothic Book"/>
           <w:sz w:val="22"/>
@@ -118,29 +200,41 @@
     <w:p>
       <w:pPr>
         <w:pStyle w:val="Ttulo1"/>
-        <w:rPr>
-          <w:rFonts w:ascii="Franklin Gothic Book" w:hAnsi="Franklin Gothic Book"/>
-          <w:sz w:val="32"/>
-          <w:szCs w:val="32"/>
-        </w:rPr>
-      </w:pPr>
-      <w:r>
-        <w:rPr>
-          <w:rFonts w:ascii="Franklin Gothic Book" w:hAnsi="Franklin Gothic Book"/>
-          <w:sz w:val="32"/>
-          <w:szCs w:val="32"/>
-        </w:rPr>
-        <w:t xml:space="preserve">PROFESSIONAL </w:t>
-      </w:r>
-      <w:r>
         <w:rPr>
           <w:rFonts w:ascii="Franklin Gothic Book" w:hAnsi="Franklin Gothic Book"/>
           <w:spacing w:val="-2"/>
           <w:sz w:val="32"/>
           <w:szCs w:val="32"/>
         </w:rPr>
+      </w:pPr>
+      <w:r>
+        <w:rPr>
+          <w:rFonts w:ascii="Franklin Gothic Book" w:hAnsi="Franklin Gothic Book"/>
+          <w:sz w:val="32"/>
+          <w:szCs w:val="32"/>
+        </w:rPr>
+        <w:t xml:space="preserve">PROFESSIONAL </w:t>
+      </w:r>
+      <w:r>
+        <w:rPr>
+          <w:rFonts w:ascii="Franklin Gothic Book" w:hAnsi="Franklin Gothic Book"/>
+          <w:spacing w:val="-2"/>
+          <w:sz w:val="32"/>
+          <w:szCs w:val="32"/>
+        </w:rPr>
         <w:t>EXPERIENCE</w:t>
       </w:r>
+    </w:p>
+    <w:p>
+      <w:pPr>
+        <w:pStyle w:val="Ttulo1"/>
+        <w:rPr>
+          <w:rFonts w:ascii="Franklin Gothic Book" w:hAnsi="Franklin Gothic Book"/>
+          <w:spacing w:val="-2"/>
+          <w:sz w:val="32"/>
+          <w:szCs w:val="32"/>
+        </w:rPr>
+      </w:pPr>
     </w:p>
     <w:p>
       <w:pPr>
@@ -181,7 +275,7 @@
         <w:spacing w:after="14"/>
       </w:pPr>
       <w:r>
-        <w:t>Designed and managed ETL pipelines integrating operational, field, and spatial datasets from over 450 producers, ensuring data consistency.</w:t>
+        <w:t>Developed and oversaw ETL pipelines integrating operational, field, and spatial datasets from over 450 producers, maintaining data consistency.</w:t>
       </w:r>
     </w:p>
     <w:p>
@@ -190,7 +284,7 @@
         <w:spacing w:after="14"/>
       </w:pPr>
       <w:r>
-        <w:t>Developed automated QA, anomaly detection, and classification procedures to enhance data reliability, reproducibility, and traceability.</w:t>
+        <w:t>Implemented automated Quality Assurance, anomaly detection, and classification processes to boost data reliability, reproducibility, and traceability.</w:t>
       </w:r>
     </w:p>
     <w:p>
@@ -199,7 +293,7 @@
         <w:spacing w:after="14"/>
       </w:pPr>
       <w:r>
-        <w:t>Developed contract-level time series, inventory summaries, and spatial reporting utilizing Python, PostgreSQL/</w:t>
+        <w:t>Designed contract-level time series, inventory summaries, and spatial reports leveraging Python, PostgreSQL/</w:t>
       </w:r>
       <w:proofErr w:type="spellStart"/>
       <w:r>
@@ -219,7 +313,7 @@
         <w:rPr>
           <w:spacing w:val="-2"/>
         </w:rPr>
-        <w:t>Implemented artificial vision solutions for forestry metrics and remote farm assessments.</w:t>
+        <w:t>Developed artificial vision solutions for forestry metrics and remote farm evaluation.</w:t>
       </w:r>
     </w:p>
     <w:p>
@@ -259,7 +353,39 @@
           <w:b/>
           <w:szCs w:val="24"/>
         </w:rPr>
-        <w:t xml:space="preserve"> Services — Founder | GIS &amp; Data Consultant </w:t>
+        <w:t xml:space="preserve"> Services — Founder | GIS &amp; </w:t>
+      </w:r>
+      <w:r>
+        <w:rPr>
+          <w:rFonts w:ascii="Franklin Gothic Book" w:hAnsi="Franklin Gothic Book"/>
+          <w:b/>
+          <w:szCs w:val="24"/>
+        </w:rPr>
+        <w:t>Analytics</w:t>
+      </w:r>
+      <w:r>
+        <w:rPr>
+          <w:rFonts w:ascii="Franklin Gothic Book" w:hAnsi="Franklin Gothic Book"/>
+          <w:b/>
+          <w:szCs w:val="24"/>
+        </w:rPr>
+        <w:t xml:space="preserve"> </w:t>
+      </w:r>
+      <w:r>
+        <w:rPr>
+          <w:rFonts w:ascii="Franklin Gothic Book" w:hAnsi="Franklin Gothic Book"/>
+          <w:b/>
+          <w:szCs w:val="24"/>
+        </w:rPr>
+        <w:t>Engineer</w:t>
+      </w:r>
+      <w:r>
+        <w:rPr>
+          <w:rFonts w:ascii="Franklin Gothic Book" w:hAnsi="Franklin Gothic Book"/>
+          <w:b/>
+          <w:szCs w:val="24"/>
+        </w:rPr>
+        <w:t xml:space="preserve"> </w:t>
       </w:r>
       <w:r>
         <w:rPr>
@@ -284,7 +410,7 @@
         <w:ind w:left="311"/>
       </w:pPr>
       <w:r>
-        <w:t>Established and spearheaded a project-focused geospatial practice, delivering remote-sensing, GIS, environmental-monitoring, and automated cartographic solutions.</w:t>
+        <w:t>spearheaded establishment of project-focused geospatial practice, delivering remote-sensing, GIS, environmental-monitoring, and automated cartographic solutions.</w:t>
       </w:r>
     </w:p>
     <w:p>
@@ -293,7 +419,7 @@
         <w:spacing w:after="14"/>
       </w:pPr>
       <w:r>
-        <w:t>Developed and advanced the Artisanal and Small-Scale Gold Mining National Action Plan, addressing intersections between organized crime and gold mining.</w:t>
+        <w:t>Advanced and enhanced the National Action Plan for Artisanal and Small-Scale Gold Mining, addressing intersections between organized crime and gold mining.</w:t>
       </w:r>
     </w:p>
     <w:p>
@@ -302,7 +428,7 @@
         <w:spacing w:after="14"/>
       </w:pPr>
       <w:r>
-        <w:t>Built and implemented Python-driven workflows for web scraping, data cleaning, and geospatial integration of heterogeneous open-source, mining, and territorial records.</w:t>
+        <w:t>Developed and deployed Python-powered workflows for web scraping, data cleansing, and geospatial integration of diverse open-source, mining, and territorial records.</w:t>
       </w:r>
     </w:p>
     <w:p>
@@ -312,7 +438,7 @@
         <w:ind w:left="311"/>
       </w:pPr>
       <w:r>
-        <w:t>Designed water-hyacinth monitoring and change analysis workflows utilizing Sentinel-2 and drone technology.</w:t>
+        <w:t>Developed water-hyacinth monitoring and analysis workflows leveraging Sentinel-2 and drone technology.</w:t>
       </w:r>
     </w:p>
     <w:p>
@@ -321,7 +447,31 @@
         <w:spacing w:after="14"/>
       </w:pPr>
       <w:r>
-        <w:t>Developed Biomonitor, a digital system for environmental monitoring during field visits, featuring fixed sampling points, water quality records, photographic evidence, and map-based reporting. Utilized React, TypeScript, Supabase, PostgreSQL/PostGIS, and Google Maps API for its implementation.</w:t>
+        <w:t xml:space="preserve">Designed and implemented </w:t>
+      </w:r>
+      <w:proofErr w:type="spellStart"/>
+      <w:r>
+        <w:t>Biomonitor</w:t>
+      </w:r>
+      <w:proofErr w:type="spellEnd"/>
+      <w:r>
+        <w:t xml:space="preserve">, a digital environmental monitoring system for field visits, comprising fixed sampling points, water quality records, photographic evidence, and map-based reporting. Leveraged React, TypeScript, </w:t>
+      </w:r>
+      <w:proofErr w:type="spellStart"/>
+      <w:r>
+        <w:t>Supabase</w:t>
+      </w:r>
+      <w:proofErr w:type="spellEnd"/>
+      <w:r>
+        <w:t>, PostgreSQL/</w:t>
+      </w:r>
+      <w:proofErr w:type="spellStart"/>
+      <w:r>
+        <w:t>PostGIS</w:t>
+      </w:r>
+      <w:proofErr w:type="spellEnd"/>
+      <w:r>
+        <w:t>, and Google Maps API for its development.</w:t>
       </w:r>
     </w:p>
     <w:p>
@@ -330,7 +480,7 @@
         <w:spacing w:after="14"/>
       </w:pPr>
       <w:r>
-        <w:t>Developed and automated geospatial production pipelines, integrating data ingestion, raster/vector processing, visualization, and reporting, significantly reducing map-production time from hours to under one minute.</w:t>
+        <w:t>Streamlined geospatial production pipelines, automating data ingestion, raster/vector processing, visualization, and reporting. Dramatically reduced map-production time from hours to under one minute.</w:t>
       </w:r>
     </w:p>
     <w:p>
@@ -339,7 +489,7 @@
         <w:spacing w:after="14"/>
       </w:pPr>
       <w:r>
-        <w:t xml:space="preserve">Completed regular project operations in July 2026 upon delivery of water-hyacinth monitoring and </w:t>
+        <w:t xml:space="preserve">Delivered and completed project operations in water-hyacinth monitoring and </w:t>
       </w:r>
       <w:proofErr w:type="spellStart"/>
       <w:r>
@@ -347,15 +497,23 @@
       </w:r>
       <w:proofErr w:type="spellEnd"/>
       <w:r>
-        <w:t xml:space="preserve"> initiatives.</w:t>
-      </w:r>
-    </w:p>
-    <w:p>
-      <w:pPr>
-        <w:pStyle w:val="Bullet"/>
-      </w:pPr>
-      <w:r>
-        <w:t xml:space="preserve">Designed and implemented the Daily Map pipeline in Google Colab, automating daily map generation through data ingestion, tabular transformation, geospatial processing, and output management using Python, GDAL, Basemap, </w:t>
+        <w:t xml:space="preserve"> initiatives in July 2026.</w:t>
+      </w:r>
+    </w:p>
+    <w:p>
+      <w:pPr>
+        <w:pStyle w:val="Bullet"/>
+      </w:pPr>
+      <w:r>
+        <w:t xml:space="preserve">Implemented Google </w:t>
+      </w:r>
+      <w:proofErr w:type="spellStart"/>
+      <w:r>
+        <w:t>Colab's</w:t>
+      </w:r>
+      <w:proofErr w:type="spellEnd"/>
+      <w:r>
+        <w:t xml:space="preserve"> Daily Map pipeline, automating daily map generation through data ingestion, tabular transformation, geospatial processing, and output management using Python, GDAL, Basemap, </w:t>
       </w:r>
       <w:proofErr w:type="spellStart"/>
       <w:r>
@@ -418,7 +576,7 @@
         <w:ind w:left="311"/>
       </w:pPr>
       <w:r>
-        <w:t>Designed multicriteria raster models for industrial, infrastructure, and sustainability evaluation, leveraging environmental, mobility, demographic, and territorial variables.</w:t>
+        <w:t>Developed multicriteria raster models for assessing industrial, infrastructure, and sustainability, utilizing environmental, mobility, demographic, and territorial variables.</w:t>
       </w:r>
     </w:p>
     <w:p>
@@ -428,7 +586,15 @@
         <w:ind w:left="311"/>
       </w:pPr>
       <w:r>
-        <w:t>Applied map algebra, weighted overlays, Saaty's Analytic Hierarchy Process, normalization, and sensitivity analysis to create suitability surfaces.</w:t>
+        <w:t xml:space="preserve">Analyzed and created suitability surfaces using map algebra, weighted overlays, </w:t>
+      </w:r>
+      <w:proofErr w:type="spellStart"/>
+      <w:r>
+        <w:t>Saaty's</w:t>
+      </w:r>
+      <w:proofErr w:type="spellEnd"/>
+      <w:r>
+        <w:t xml:space="preserve"> Analytic Hierarchy Process, normalization, and sensitivity analysis.</w:t>
       </w:r>
     </w:p>
     <w:p>
@@ -438,7 +604,23 @@
         <w:ind w:left="311"/>
       </w:pPr>
       <w:r>
-        <w:t>Implemented reproducible Python processing using NumPy, GDAL, rasterio, and GeoPandas to transition traditional ArcMap/ENVI procedures.</w:t>
+        <w:t xml:space="preserve">Developed Python processing with NumPy, GDAL, </w:t>
+      </w:r>
+      <w:proofErr w:type="spellStart"/>
+      <w:r>
+        <w:t>rasterio</w:t>
+      </w:r>
+      <w:proofErr w:type="spellEnd"/>
+      <w:r>
+        <w:t xml:space="preserve">, and </w:t>
+      </w:r>
+      <w:proofErr w:type="spellStart"/>
+      <w:r>
+        <w:t>GeoPandas</w:t>
+      </w:r>
+      <w:proofErr w:type="spellEnd"/>
+      <w:r>
+        <w:t xml:space="preserve"> to streamline traditional ArcMap/ENVI procedures, ensuring reproducibility.</w:t>
       </w:r>
     </w:p>
     <w:p>
@@ -448,7 +630,15 @@
         <w:ind w:left="311"/>
       </w:pPr>
       <w:r>
-        <w:t>Clipped, reprojected, resampled, validated CRS, managed NoData controls, and generated analytical outputs.</w:t>
+        <w:t xml:space="preserve">Analyzed, reprojected, resampled, validated Coordinate Reference Systems (CRS), managed </w:t>
+      </w:r>
+      <w:proofErr w:type="spellStart"/>
+      <w:r>
+        <w:t>NoData</w:t>
+      </w:r>
+      <w:proofErr w:type="spellEnd"/>
+      <w:r>
+        <w:t xml:space="preserve"> controls, and produced analytical outputs.</w:t>
       </w:r>
     </w:p>
     <w:p>
@@ -465,6 +655,23 @@
     </w:p>
     <w:p>
       <w:pPr>
+        <w:rPr>
+          <w:rFonts w:ascii="Franklin Gothic Book" w:hAnsi="Franklin Gothic Book"/>
+          <w:b/>
+          <w:szCs w:val="24"/>
+        </w:rPr>
+      </w:pPr>
+      <w:r>
+        <w:rPr>
+          <w:rFonts w:ascii="Franklin Gothic Book" w:hAnsi="Franklin Gothic Book"/>
+          <w:b/>
+          <w:szCs w:val="24"/>
+        </w:rPr>
+        <w:br w:type="page"/>
+      </w:r>
+    </w:p>
+    <w:p>
+      <w:pPr>
         <w:ind w:left="188"/>
         <w:rPr>
           <w:rFonts w:ascii="Franklin Gothic Book" w:hAnsi="Franklin Gothic Book"/>
@@ -478,6 +685,7 @@
           <w:b/>
           <w:szCs w:val="24"/>
         </w:rPr>
+        <w:lastRenderedPageBreak/>
         <w:t>Soluciones</w:t>
       </w:r>
       <w:proofErr w:type="spellEnd"/>
@@ -487,28 +695,46 @@
           <w:b/>
           <w:szCs w:val="24"/>
         </w:rPr>
-        <w:t xml:space="preserve"> SIG — GIS R&amp;D + Data Analyst </w:t>
-      </w:r>
-      <w:r>
-        <w:rPr>
-          <w:rFonts w:ascii="Franklin Gothic Book" w:hAnsi="Franklin Gothic Book"/>
-          <w:szCs w:val="24"/>
-        </w:rPr>
-        <w:t xml:space="preserve">| </w:t>
-      </w:r>
-      <w:r>
-        <w:rPr>
-          <w:rFonts w:ascii="Franklin Gothic Book" w:hAnsi="Franklin Gothic Book"/>
-          <w:szCs w:val="24"/>
-        </w:rPr>
-        <w:t>Apr</w:t>
-      </w:r>
-      <w:r>
-        <w:rPr>
-          <w:rFonts w:ascii="Franklin Gothic Book" w:hAnsi="Franklin Gothic Book"/>
-          <w:szCs w:val="24"/>
-        </w:rPr>
-        <w:t xml:space="preserve"> 2021 – Oct </w:t>
+        <w:t xml:space="preserve"> SIG — </w:t>
+      </w:r>
+      <w:r>
+        <w:rPr>
+          <w:rFonts w:ascii="Franklin Gothic Book" w:hAnsi="Franklin Gothic Book"/>
+          <w:b/>
+          <w:szCs w:val="24"/>
+        </w:rPr>
+        <w:t>Project Management</w:t>
+      </w:r>
+      <w:r>
+        <w:rPr>
+          <w:rFonts w:ascii="Franklin Gothic Book" w:hAnsi="Franklin Gothic Book"/>
+          <w:b/>
+          <w:szCs w:val="24"/>
+        </w:rPr>
+        <w:t xml:space="preserve"> + </w:t>
+      </w:r>
+      <w:r>
+        <w:rPr>
+          <w:rFonts w:ascii="Franklin Gothic Book" w:hAnsi="Franklin Gothic Book"/>
+          <w:b/>
+          <w:szCs w:val="24"/>
+        </w:rPr>
+        <w:t xml:space="preserve">Spatial </w:t>
+      </w:r>
+      <w:r>
+        <w:rPr>
+          <w:rFonts w:ascii="Franklin Gothic Book" w:hAnsi="Franklin Gothic Book"/>
+          <w:b/>
+          <w:szCs w:val="24"/>
+        </w:rPr>
+        <w:t xml:space="preserve">Data Analyst </w:t>
+      </w:r>
+      <w:r>
+        <w:rPr>
+          <w:rFonts w:ascii="Franklin Gothic Book" w:hAnsi="Franklin Gothic Book"/>
+          <w:szCs w:val="24"/>
+        </w:rPr>
+        <w:t xml:space="preserve">| Apr 2021 – Oct </w:t>
       </w:r>
       <w:r>
         <w:rPr>
@@ -525,7 +751,7 @@
         <w:spacing w:after="14"/>
       </w:pPr>
       <w:r>
-        <w:t>Developed GIS information workflows and assessed spatial platform solutions for municipal and state clients.</w:t>
+        <w:t>Designed and implemented GIS workflows for spatial data analysis, catering to municipal and state clients. Evaluated potential platform solutions.</w:t>
       </w:r>
     </w:p>
     <w:p>
@@ -534,11 +760,15 @@
         <w:spacing w:after="14"/>
       </w:pPr>
       <w:r>
-        <w:t xml:space="preserve">Developed Python and ArcPy automation tools to enhance repeatability and streamline ArcGIS workflows in </w:t>
-      </w:r>
-      <w:r>
-        <w:lastRenderedPageBreak/>
-        <w:t>public-sector projects.</w:t>
+        <w:t xml:space="preserve">Developed and implemented Python and </w:t>
+      </w:r>
+      <w:proofErr w:type="spellStart"/>
+      <w:r>
+        <w:t>ArcPy</w:t>
+      </w:r>
+      <w:proofErr w:type="spellEnd"/>
+      <w:r>
+        <w:t xml:space="preserve"> automation tools to boost repeatability and optimize ArcGIS workflows in public-sector projects.</w:t>
       </w:r>
     </w:p>
     <w:p>
@@ -547,7 +777,7 @@
         <w:spacing w:after="14"/>
       </w:pPr>
       <w:r>
-        <w:t>Developed over 10 metropolitan plans, digital risk atlases, and territorial-planning instruments through the use of map algebra, terrain analysis, and multicriteria modeling.</w:t>
+        <w:t>Formulated over 10 metropolitan plans, digital risk atlases, and territorial-planning instruments utilizing map algebra, terrain analysis, and multicriteria modeling.</w:t>
       </w:r>
     </w:p>
     <w:p>
@@ -556,7 +786,7 @@
         <w:spacing w:after="14"/>
       </w:pPr>
       <w:r>
-        <w:t>Analyzed client requirements, translated functional needs into technical specifications, coordinated changes with development team, tested outputs and provided support during client follow-up.</w:t>
+        <w:t>Developed technical specifications from client requirements, collaborated with development team on changes, tested outputs, and offered support during client follow-up.</w:t>
       </w:r>
     </w:p>
     <w:p>
@@ -568,6 +798,7 @@
         </w:numPr>
         <w:spacing w:after="14"/>
         <w:ind w:left="311" w:hanging="125"/>
+        <w:jc w:val="right"/>
       </w:pPr>
     </w:p>
     <w:p>
@@ -592,7 +823,19 @@
         <w:rPr>
           <w:b/>
         </w:rPr>
-        <w:t xml:space="preserve"> — External GIS &amp; Environmental Consultant | Project-based subcontractor | 2020–2021</w:t>
+        <w:t xml:space="preserve"> — </w:t>
+      </w:r>
+      <w:r>
+        <w:rPr>
+          <w:b/>
+        </w:rPr>
+        <w:t xml:space="preserve">Environmental Data Analyst + GIS </w:t>
+      </w:r>
+      <w:r>
+        <w:rPr>
+          <w:b/>
+        </w:rPr>
+        <w:t>Consultant | Project-based subcontractor | 2020–2021</w:t>
       </w:r>
     </w:p>
     <w:p>
@@ -601,7 +844,7 @@
         <w:spacing w:after="14"/>
       </w:pPr>
       <w:r>
-        <w:t>Designed geospatial inputs for the Tolimán Micro-Watershed Management Plan and Socio-Hydrological Diagnosis.</w:t>
+        <w:t>Developed geospatial inputs for the Tolimán Micro-Watershed Management Plan and Socio-Hydrological Diagnosis.</w:t>
       </w:r>
     </w:p>
     <w:p>
@@ -610,7 +853,7 @@
         <w:spacing w:after="14"/>
       </w:pPr>
       <w:r>
-        <w:t>Analyzed and integrated digital elevation models, hydrological variables, land-use and vegetation rasters, satellite imagery, and community data.</w:t>
+        <w:t>Integrated and analyzed digital elevation models, hydrological variables, land-use and vegetation rasters, satellite imagery, and community data for comprehensive analysis.</w:t>
       </w:r>
     </w:p>
     <w:p>
@@ -619,7 +862,7 @@
         <w:spacing w:after="14"/>
       </w:pPr>
       <w:r>
-        <w:t>Applied raster map algebra, terrain analysis, and multicriteria modeling to identify environmental pressures, management priorities, and intervention areas.</w:t>
+        <w:t>Applied raster map algebra, terrain analysis, and multicriteria modeling to pinpoint environmental pressures, management priorities, and intervention areas.</w:t>
       </w:r>
     </w:p>
     <w:p>
@@ -628,7 +871,7 @@
         <w:spacing w:after="14"/>
       </w:pPr>
       <w:r>
-        <w:t>Established standardized criteria for resolution, extent, projection, and classification across diverse raster and vector sources.</w:t>
+        <w:t>Developed consistent evaluation criteria for resolution, extent, projection, and classification across various raster and vector data sources.</w:t>
       </w:r>
     </w:p>
     <w:p>
@@ -664,7 +907,7 @@
         <w:spacing w:after="14"/>
       </w:pPr>
       <w:r>
-        <w:t>Assessed and ensured compliance with environmental, health, and safety regulations for industrial facilities, covering atmospheric emissions, waste management, and operational risk mitigation.</w:t>
+        <w:t>Assessed and ensured compliance with environmental, health, and safety regulations for industrial facilities, managing atmospheric emissions, waste, and operational risk mitigation.</w:t>
       </w:r>
     </w:p>
     <w:p>
@@ -673,7 +916,7 @@
         <w:spacing w:after="14"/>
       </w:pPr>
       <w:r>
-        <w:t>Assessed and translated Mexican environmental standards, permits, and reporting requirements into compliance matrices.</w:t>
+        <w:t>Evaluated and translated Mexican environmental standards, permits, and reporting requirements into compliance matrices for efficient assessment.</w:t>
       </w:r>
     </w:p>
     <w:p>
@@ -682,7 +925,7 @@
         <w:spacing w:after="14"/>
       </w:pPr>
       <w:r>
-        <w:t>Analyzed atmospheric conditions and pollutant patterns in industrial areas using Sentinel Hub EO Browser and Earth Observation datasets.</w:t>
+        <w:t>Analyzed atmospheric conditions and pollutant patterns in industrial areas, utilizing Sentinel Hub EO Browser and Earth Observation datasets.</w:t>
       </w:r>
     </w:p>
     <w:p>
@@ -691,7 +934,7 @@
         <w:spacing w:after="14"/>
       </w:pPr>
       <w:r>
-        <w:t>Analyzed and integrated satellite observations, facility locations, land uses, and environmental receptors into GIS-based technical reporting.</w:t>
+        <w:t>Analyzed and integrated satellite data, facility locations, land uses, and environmental receptors into GIS-based technical reports.</w:t>
       </w:r>
     </w:p>
     <w:p>
@@ -727,7 +970,7 @@
         <w:ind w:left="311"/>
       </w:pPr>
       <w:r>
-        <w:t>Streamlined parcel identification, cadastral validation, and user requests through ArcGIS and geodatabase workflows, while interpreting coordinates.</w:t>
+        <w:t>Optimized parcel identification, cadastral validation, and user requests using ArcGIS and geodatabase workflows, while interpreting coordinates.</w:t>
       </w:r>
     </w:p>
     <w:p>
@@ -736,7 +979,7 @@
         <w:ind w:left="311"/>
       </w:pPr>
       <w:r>
-        <w:t>Analyzed spatial consistency between cartographic records, parcel boundaries, and documentary evidence</w:t>
+        <w:t>Assessed spatial consistency between cartographic records, parcel boundaries, and documentary evidence</w:t>
       </w:r>
     </w:p>
     <w:p>
@@ -772,7 +1015,7 @@
         <w:ind w:left="311"/>
       </w:pPr>
       <w:r>
-        <w:t>Led international environmental-policy projects, integrating legal research, territorial evidence, and structured analytical methodologies.</w:t>
+        <w:t>Directed international environmental policy projects, incorporating legal research, territorial evidence, and structured analytical methodologies.</w:t>
       </w:r>
     </w:p>
     <w:p>
@@ -781,7 +1024,7 @@
         <w:ind w:left="311"/>
       </w:pPr>
       <w:r>
-        <w:t>Analyzed legal frameworks and environmental conditions comparatively to aid UNEP in addressing plastic pollution.</w:t>
+        <w:t>Evaluated comparative legal frameworks and environmental conditions to assist UNEP in combating plastic pollution.</w:t>
       </w:r>
     </w:p>
     <w:p>
@@ -790,7 +1033,7 @@
         <w:ind w:left="311"/>
       </w:pPr>
       <w:r>
-        <w:t>Developed a roadmap for sustainable livelihoods in mercury-dependent artisanal and small-scale mining regions, integrating environmental, territorial, and gender concerns.</w:t>
+        <w:t>Devised a roadmap for self-sustaining livelihoods in mercury-contaminated artisanal and small-scale mining zones, addressing environmental, territorial, and gender issues.</w:t>
       </w:r>
     </w:p>
     <w:p>
@@ -799,7 +1042,7 @@
         <w:ind w:left="311"/>
       </w:pPr>
       <w:r>
-        <w:t>Analyzed and integrated environmental, socioeconomic, and geographic data into analytical matrices, maps, and technical deliverables.</w:t>
+        <w:t>Analyzed and integrated environmental, socioeconomic, and geographic data into analytical matrices, maps, and technical deliverables for effective decision-making.</w:t>
       </w:r>
     </w:p>
     <w:p>
@@ -826,7 +1069,19 @@
         <w:rPr>
           <w:b/>
         </w:rPr>
-        <w:t>Municipality of Querétaro, Public Services Secretariat — Environmental Compliance Supervisor | 2019</w:t>
+        <w:t xml:space="preserve">Municipality of Querétaro, Public Services Secretariat — </w:t>
+      </w:r>
+      <w:r>
+        <w:rPr>
+          <w:b/>
+        </w:rPr>
+        <w:t>EHS</w:t>
+      </w:r>
+      <w:r>
+        <w:rPr>
+          <w:b/>
+        </w:rPr>
+        <w:t xml:space="preserve"> Supervisor | 2019</w:t>
       </w:r>
     </w:p>
     <w:p>
@@ -835,7 +1090,7 @@
         <w:ind w:left="311"/>
       </w:pPr>
       <w:r>
-        <w:t>Assessed regulatory compliance in solid-waste management and landfill operations at the municipal level.</w:t>
+        <w:t>Evaluated regulatory compliance in solid-waste management and landfill operations at the municipal level.</w:t>
       </w:r>
     </w:p>
     <w:p>
@@ -844,7 +1099,7 @@
         <w:ind w:left="311"/>
       </w:pPr>
       <w:r>
-        <w:t>Analyzed raster imagery, remote-sensing interpretation, and GIS data to evaluate landfill infrastructure, adjacent land-cover conditions, and multitemporal changes.</w:t>
+        <w:t>Analyzed raster imagery, remote-sensing interpretation, and GIS data for assessing landfill infrastructure, adjoining land-cover conditions, and temporal variations.</w:t>
       </w:r>
     </w:p>
     <w:p>
@@ -853,7 +1108,7 @@
         <w:ind w:left="311"/>
       </w:pPr>
       <w:r>
-        <w:t>Analyzed and incorporated field observations, georeferenced evidence, and spatial datasets into technical reports and compliance follow-ups.</w:t>
+        <w:t>Analyzed and integrated field observations, georeferenced evidence, and spatial datasets into technical reports and compliance follow-ups.</w:t>
       </w:r>
     </w:p>
     <w:p>
@@ -865,6 +1120,21 @@
         </w:numPr>
         <w:ind w:left="311" w:hanging="125"/>
       </w:pPr>
+    </w:p>
+    <w:p>
+      <w:pPr>
+        <w:rPr>
+          <w:rFonts w:ascii="Franklin Gothic Book" w:hAnsi="Franklin Gothic Book"/>
+          <w:b/>
+          <w:szCs w:val="24"/>
+        </w:rPr>
+      </w:pPr>
+      <w:r>
+        <w:rPr>
+          <w:b/>
+        </w:rPr>
+        <w:br w:type="page"/>
+      </w:r>
     </w:p>
     <w:p>
       <w:pPr>
@@ -880,7 +1150,20 @@
         <w:rPr>
           <w:b/>
         </w:rPr>
-        <w:t>CONACYT–CENTROMET — Geospatial &amp; Remote Sensing Research Intern | 2018</w:t>
+        <w:lastRenderedPageBreak/>
+        <w:t xml:space="preserve">CONACYT–CENTROMET — </w:t>
+      </w:r>
+      <w:r>
+        <w:rPr>
+          <w:b/>
+        </w:rPr>
+        <w:t>S</w:t>
+      </w:r>
+      <w:r>
+        <w:rPr>
+          <w:b/>
+        </w:rPr>
+        <w:t>patial &amp; Remote Sensing Research Intern | 2018</w:t>
       </w:r>
     </w:p>
     <w:p>
@@ -889,7 +1172,7 @@
         <w:ind w:left="311"/>
       </w:pPr>
       <w:r>
-        <w:t>Assessed urban tree ecosystem services estimation across the Querétaro Metropolitan Area.</w:t>
+        <w:t>Evaluated urban tree ecosystem services estimation within the Querétaro Metropolitan Area.</w:t>
       </w:r>
     </w:p>
     <w:p>
@@ -898,7 +1181,7 @@
         <w:ind w:left="311"/>
       </w:pPr>
       <w:r>
-        <w:t>Conducted georeferenced tree inventory integration, urban land-cover data analysis, environmental variable assessment, and remote sensing raster data utilization.</w:t>
+        <w:t>Conducted integration of georeferenced tree inventory, analyzed urban land-cover data, assessed environmental variables, and utilized remote sensing raster data.</w:t>
       </w:r>
     </w:p>
     <w:p>
@@ -907,11 +1190,7 @@
         <w:ind w:left="311"/>
       </w:pPr>
       <w:r>
-        <w:t xml:space="preserve">Analyzed and produced metropolitan-scale environmental indicators and thematic maps through the application </w:t>
-      </w:r>
-      <w:r>
-        <w:lastRenderedPageBreak/>
-        <w:t>of raster processing, reprojection, and spatial validation techniques.</w:t>
+        <w:t>Developed and generated metropolitan-scale environmental indicators and thematic maps utilizing raster processing, reprojection, and spatial validation techniques.</w:t>
       </w:r>
     </w:p>
     <w:p>
@@ -938,7 +1217,19 @@
         <w:rPr>
           <w:b/>
         </w:rPr>
-        <w:t>Centro INAH Querétaro — Participatory GIS &amp; Remote Sensing Assistant | Project-based | 2017</w:t>
+        <w:t xml:space="preserve">Centro INAH Querétaro — </w:t>
+      </w:r>
+      <w:r>
+        <w:rPr>
+          <w:b/>
+        </w:rPr>
+        <w:t>GIS Specialist</w:t>
+      </w:r>
+      <w:r>
+        <w:rPr>
+          <w:b/>
+        </w:rPr>
+        <w:t>| Project-based | 2017</w:t>
       </w:r>
     </w:p>
     <w:p>
@@ -947,7 +1238,15 @@
         <w:ind w:left="311"/>
       </w:pPr>
       <w:r>
-        <w:t>Led participatory mapping with the Otomí-Chichimeca community of Tolimán, documenting ritual routes, family chapels, and culturally significant communal land.</w:t>
+        <w:t xml:space="preserve">Mapped communally significant sites with the </w:t>
+      </w:r>
+      <w:proofErr w:type="spellStart"/>
+      <w:r>
+        <w:t>Otomí-Chichimeca</w:t>
+      </w:r>
+      <w:proofErr w:type="spellEnd"/>
+      <w:r>
+        <w:t xml:space="preserve"> community of Tolimán, including ritual routes, family chapels, and culturally important land.</w:t>
       </w:r>
     </w:p>
     <w:p>
@@ -956,7 +1255,7 @@
         <w:ind w:left="311"/>
       </w:pPr>
       <w:r>
-        <w:t>Analyzed and integrated community knowledge, field observations, raster basemaps, and remotely sensed imagery into comprehensive territorial documentation.</w:t>
+        <w:t>Integrated comprehensive territorial documentation through analysis of community knowledge, field observations, raster basemaps, and remotely sensed imagery.</w:t>
       </w:r>
     </w:p>
     <w:p>
@@ -965,7 +1264,7 @@
         <w:ind w:left="311"/>
       </w:pPr>
       <w:r>
-        <w:t>Delivered spatial evidence substantiating an anthropological evaluation of land at risk due to a proposed poultry development project.</w:t>
+        <w:t>Analyzed and provided spatial evidence substantiating an anthropological assessment of at-risk land for a proposed poultry development project.</w:t>
       </w:r>
     </w:p>
     <w:p>
@@ -1024,31 +1323,47 @@
         <w:pStyle w:val="Bullet"/>
       </w:pPr>
       <w:r>
-        <w:t>Developed a semantic-segmentation methodology for detecting land-use changes associated with avocado cultivation in environmentally sensitive areas.</w:t>
-      </w:r>
-    </w:p>
-    <w:p>
-      <w:pPr>
-        <w:pStyle w:val="Bullet"/>
-      </w:pPr>
-      <w:r>
-        <w:t>Developed multiclass raster datasets integrating Sentinel-2 and high-resolution imagery; created masks and tiles and designed geographically separated training, validation, and testing partitions to minimize spatial leakage.</w:t>
-      </w:r>
-    </w:p>
-    <w:p>
-      <w:pPr>
-        <w:pStyle w:val="Bullet"/>
-      </w:pPr>
-      <w:r>
-        <w:t>Conducted PyTorch-based experiments, implementing strategies for class imbalance such as focal loss, weighted cross-entropy, and targeted oversampling.</w:t>
-      </w:r>
-    </w:p>
-    <w:p>
-      <w:pPr>
-        <w:pStyle w:val="Bullet"/>
-      </w:pPr>
-      <w:r>
-        <w:t>Assessed performance at class level utilizing IoU, precision, recall, F1, and confusion matrices.</w:t>
+        <w:t>Implemented a semantic-segmentation approach to identify land-use modifications linked to avocado farming in environmentally sensitive regions.</w:t>
+      </w:r>
+    </w:p>
+    <w:p>
+      <w:pPr>
+        <w:pStyle w:val="Bullet"/>
+      </w:pPr>
+      <w:r>
+        <w:t>Developed multiclass raster datasets integrating Sentinel-2 and high-resolution imagery, creating masks, tiles, and geographically separate training, validation, and testing partitions to minimize spatial leakage.</w:t>
+      </w:r>
+    </w:p>
+    <w:p>
+      <w:pPr>
+        <w:pStyle w:val="Bullet"/>
+      </w:pPr>
+      <w:r>
+        <w:t xml:space="preserve">Conducted experiments in </w:t>
+      </w:r>
+      <w:proofErr w:type="spellStart"/>
+      <w:r>
+        <w:t>PyTorch</w:t>
+      </w:r>
+      <w:proofErr w:type="spellEnd"/>
+      <w:r>
+        <w:t>, employing strategies to address class imbalance, including focal loss, weighted cross-entropy, and targeted oversampling.</w:t>
+      </w:r>
+    </w:p>
+    <w:p>
+      <w:pPr>
+        <w:pStyle w:val="Bullet"/>
+      </w:pPr>
+      <w:r>
+        <w:t xml:space="preserve">Evaluated class performance using </w:t>
+      </w:r>
+      <w:proofErr w:type="spellStart"/>
+      <w:r>
+        <w:t>IoU</w:t>
+      </w:r>
+      <w:proofErr w:type="spellEnd"/>
+      <w:r>
+        <w:t>, precision, recall, F1, and confusion matrices.</w:t>
       </w:r>
     </w:p>
     <w:p>
@@ -1111,23 +1426,55 @@
         <w:pStyle w:val="Bullet"/>
       </w:pPr>
       <w:r>
-        <w:t>Analyzed multitemporal Sentinel-2 surface reflectance, cloud management, and red-edge indices to assess and track aquatic vegetation coverage evolution over time.</w:t>
-      </w:r>
-    </w:p>
-    <w:p>
-      <w:pPr>
-        <w:pStyle w:val="Bullet"/>
-      </w:pPr>
-      <w:r>
-        <w:t>Generated orthomosaics for drones and established fixed sampling points for spatial validation.</w:t>
-      </w:r>
-    </w:p>
-    <w:p>
-      <w:pPr>
-        <w:pStyle w:val="Bullet"/>
-      </w:pPr>
-      <w:r>
-        <w:t>Developed a comprehensive digital field-monitoring application, incorporating map, visit, water-quality, and reporting modules, using React, TypeScript, Supabase/PostGIS, MapLibre GL JS, and photographic storage.</w:t>
+        <w:t>Assessed and monitored the evolution of aquatic vegetation coverage over time using temporal analysis of Sentinel-2 surface reflectance, cloud management, and red-edge indices.</w:t>
+      </w:r>
+    </w:p>
+    <w:p>
+      <w:pPr>
+        <w:pStyle w:val="Bullet"/>
+      </w:pPr>
+      <w:r>
+        <w:t xml:space="preserve">Generated </w:t>
+      </w:r>
+      <w:proofErr w:type="spellStart"/>
+      <w:r>
+        <w:t>orthomosaics</w:t>
+      </w:r>
+      <w:proofErr w:type="spellEnd"/>
+      <w:r>
+        <w:t xml:space="preserve"> for drones and established fixed validation sampling points for spatial accuracy.</w:t>
+      </w:r>
+    </w:p>
+    <w:p>
+      <w:pPr>
+        <w:pStyle w:val="Bullet"/>
+      </w:pPr>
+      <w:r>
+        <w:t xml:space="preserve">Designed and developed a comprehensive digital field-monitoring application, encompassing map, visit, water-quality, and reporting modules, utilizing React, TypeScript, </w:t>
+      </w:r>
+      <w:proofErr w:type="spellStart"/>
+      <w:r>
+        <w:t>Supabase</w:t>
+      </w:r>
+      <w:proofErr w:type="spellEnd"/>
+      <w:r>
+        <w:t>/</w:t>
+      </w:r>
+      <w:proofErr w:type="spellStart"/>
+      <w:r>
+        <w:t>PostGIS</w:t>
+      </w:r>
+      <w:proofErr w:type="spellEnd"/>
+      <w:r>
+        <w:t xml:space="preserve">, </w:t>
+      </w:r>
+      <w:proofErr w:type="spellStart"/>
+      <w:r>
+        <w:t>MapLibre</w:t>
+      </w:r>
+      <w:proofErr w:type="spellEnd"/>
+      <w:r>
+        <w:t xml:space="preserve"> GL JS, and photographic storage.</w:t>
       </w:r>
     </w:p>
     <w:p>
@@ -1168,7 +1515,7 @@
         <w:pStyle w:val="Bullet"/>
       </w:pPr>
       <w:r>
-        <w:t xml:space="preserve">Analyzed and integrated environmental, mobility, terrain, infrastructure, and demographic data utilizing map algebra, weighted overlays, and </w:t>
+        <w:t xml:space="preserve">Analyzed and integrated environmental, mobility, terrain, infrastructure, and demographic data using map algebra, weighted overlays, and </w:t>
       </w:r>
       <w:proofErr w:type="spellStart"/>
       <w:r>
@@ -1184,7 +1531,7 @@
         <w:pStyle w:val="Bullet"/>
       </w:pPr>
       <w:r>
-        <w:t xml:space="preserve">Streamlined desktop GIS processes into reproducible workflows using NumPy, GDAL, </w:t>
+        <w:t xml:space="preserve">Optimized desktop GIS processes for reproducible workflows using NumPy, GDAL, </w:t>
       </w:r>
       <w:proofErr w:type="spellStart"/>
       <w:r>
@@ -1244,7 +1591,7 @@
         <w:pStyle w:val="Bullet"/>
       </w:pPr>
       <w:r>
-        <w:t xml:space="preserve">Developed GIS platforms and risk atlases for El Marqués, Puebla, Santa Catarina, </w:t>
+        <w:t xml:space="preserve">Designed and implemented GIS platforms and risk atlases for El Marqués, Puebla, Santa Catarina, </w:t>
       </w:r>
       <w:proofErr w:type="spellStart"/>
       <w:r>
@@ -1260,7 +1607,7 @@
         <w:pStyle w:val="Bullet"/>
       </w:pPr>
       <w:r>
-        <w:t>Defined requirements, automated ArcGIS, validated data, conducted testing, managed client feedback, and ensured delivery continuity.</w:t>
+        <w:t>Analyzed requirements, automated ArcGIS, validated data, conducted testing, managed client feedback, and ensured continuous delivery.</w:t>
       </w:r>
     </w:p>
     <w:p>
@@ -1323,15 +1670,47 @@
         <w:pStyle w:val="Bullet"/>
       </w:pPr>
       <w:r>
-        <w:t>Developed a web-based environmental monitoring system featuring reusable components, map views, fixed points, visit records, water-quality data, and report generation.</w:t>
-      </w:r>
-    </w:p>
-    <w:p>
-      <w:pPr>
-        <w:pStyle w:val="Bullet"/>
-      </w:pPr>
-      <w:r>
-        <w:t>Utilized: React, TypeScript, Vite, Supabase (PostgreSQL/PostGIS and Auth), MapLibre GL JS, Cloudflare R2, and GitHub Pages.</w:t>
+        <w:t>Designed and implemented a web-based environmental monitoring system, comprising reusable components, map views, fixed points, visit records, water-quality data, and report generation.</w:t>
+      </w:r>
+    </w:p>
+    <w:p>
+      <w:pPr>
+        <w:pStyle w:val="Bullet"/>
+      </w:pPr>
+      <w:r>
+        <w:t xml:space="preserve">Utilized React, TypeScript, </w:t>
+      </w:r>
+      <w:proofErr w:type="spellStart"/>
+      <w:r>
+        <w:t>Vite</w:t>
+      </w:r>
+      <w:proofErr w:type="spellEnd"/>
+      <w:r>
+        <w:t xml:space="preserve">, </w:t>
+      </w:r>
+      <w:proofErr w:type="spellStart"/>
+      <w:r>
+        <w:t>Supabase</w:t>
+      </w:r>
+      <w:proofErr w:type="spellEnd"/>
+      <w:r>
+        <w:t xml:space="preserve"> (PostgreSQL/</w:t>
+      </w:r>
+      <w:proofErr w:type="spellStart"/>
+      <w:r>
+        <w:t>PostGIS</w:t>
+      </w:r>
+      <w:proofErr w:type="spellEnd"/>
+      <w:r>
+        <w:t xml:space="preserve"> and Auth), </w:t>
+      </w:r>
+      <w:proofErr w:type="spellStart"/>
+      <w:r>
+        <w:t>MapLibre</w:t>
+      </w:r>
+      <w:proofErr w:type="spellEnd"/>
+      <w:r>
+        <w:t xml:space="preserve"> GL JS, Cloudflare R2, and GitHub Pages in projects.</w:t>
       </w:r>
     </w:p>
     <w:p>
@@ -1364,39 +1743,20 @@
         <w:rPr>
           <w:i/>
         </w:rPr>
-        <w:t xml:space="preserve"> | INECC / external consultancy | 2023</w:t>
-      </w:r>
-    </w:p>
-    <w:p>
-      <w:pPr>
-        <w:pStyle w:val="Bullet"/>
-      </w:pPr>
-      <w:r>
-        <w:t>Analyzed and integrated open-source, mining, environmental, and territorial records through web scraping, entity standardization, data cleaning, and geospatial analysis.</w:t>
-      </w:r>
-    </w:p>
-    <w:p>
-      <w:pPr>
-        <w:pStyle w:val="Bullet"/>
-        <w:numPr>
-          <w:ilvl w:val="0"/>
-          <w:numId w:val="0"/>
-        </w:numPr>
-        <w:spacing w:after="14"/>
-        <w:ind w:left="323" w:hanging="125"/>
-      </w:pPr>
-    </w:p>
-    <w:p>
-      <w:pPr>
-        <w:pStyle w:val="Textoindependiente"/>
-        <w:spacing w:before="225"/>
-        <w:ind w:left="0" w:firstLine="0"/>
-        <w:rPr>
-          <w:rFonts w:ascii="Franklin Gothic Book" w:hAnsi="Franklin Gothic Book"/>
-          <w:sz w:val="22"/>
-          <w:szCs w:val="22"/>
-        </w:rPr>
-      </w:pPr>
+        <w:t xml:space="preserve"> | INECC / UNEP | 2023</w:t>
+      </w:r>
+    </w:p>
+    <w:p>
+      <w:pPr>
+        <w:pStyle w:val="Bullet"/>
+      </w:pPr>
+      <w:r>
+        <w:t xml:space="preserve">Integrated open-source, mining, environmental, and territorial records via web scraping, entity standardization, </w:t>
+      </w:r>
+      <w:r>
+        <w:lastRenderedPageBreak/>
+        <w:t>data cleaning, and geospatial analysis.</w:t>
+      </w:r>
     </w:p>
     <w:p>
       <w:pPr>
@@ -1404,9 +1764,6 @@
           <w:rFonts w:eastAsia="Arial" w:cs="Arial"/>
         </w:rPr>
       </w:pPr>
-      <w:r>
-        <w:br w:type="page"/>
-      </w:r>
     </w:p>
     <w:p>
       <w:pPr>
@@ -1417,13 +1774,22 @@
           <w:szCs w:val="32"/>
         </w:rPr>
       </w:pPr>
-      <w:r>
+    </w:p>
+    <w:p>
+      <w:pPr>
+        <w:pStyle w:val="Ttulo1"/>
         <w:rPr>
           <w:rFonts w:ascii="Franklin Gothic Book" w:hAnsi="Franklin Gothic Book"/>
           <w:sz w:val="32"/>
           <w:szCs w:val="32"/>
         </w:rPr>
-        <w:lastRenderedPageBreak/>
+      </w:pPr>
+      <w:r>
+        <w:rPr>
+          <w:rFonts w:ascii="Franklin Gothic Book" w:hAnsi="Franklin Gothic Book"/>
+          <w:sz w:val="32"/>
+          <w:szCs w:val="32"/>
+        </w:rPr>
         <w:t xml:space="preserve">TECHNICAL </w:t>
       </w:r>
       <w:r>
@@ -1535,20 +1901,17 @@
               <w:jc w:val="center"/>
               <w:rPr>
                 <w:rFonts w:ascii="Franklin Gothic Book" w:hAnsi="Franklin Gothic Book"/>
+                <w:bCs/>
+                <w:spacing w:val="-2"/>
               </w:rPr>
             </w:pPr>
             <w:r>
               <w:rPr>
                 <w:rFonts w:ascii="Franklin Gothic Book" w:hAnsi="Franklin Gothic Book"/>
-              </w:rPr>
-              <w:t xml:space="preserve">Data </w:t>
-            </w:r>
-            <w:r>
-              <w:rPr>
-                <w:rFonts w:ascii="Franklin Gothic Book" w:hAnsi="Franklin Gothic Book"/>
+                <w:bCs/>
                 <w:spacing w:val="-2"/>
               </w:rPr>
-              <w:t>Engineering</w:t>
+              <w:t>AI / LLMs</w:t>
             </w:r>
           </w:p>
         </w:tc>
@@ -1563,13 +1926,29 @@
               <w:jc w:val="center"/>
               <w:rPr>
                 <w:rFonts w:ascii="Franklin Gothic Book" w:hAnsi="Franklin Gothic Book"/>
+                <w:bCs/>
               </w:rPr>
             </w:pPr>
             <w:r>
               <w:rPr>
                 <w:rFonts w:ascii="Franklin Gothic Book" w:hAnsi="Franklin Gothic Book"/>
-              </w:rPr>
-              <w:t>Developed proficiency in Python, SQL, PostgreSQL, DuckDB, Polars, Pandas, SQLAlchemy, and ETL pipelines for data validation.</w:t>
+                <w:bCs/>
+              </w:rPr>
+              <w:t>Large Language Models (LLMs), Retrieval-Augmented Generation (RAG</w:t>
+            </w:r>
+            <w:r>
+              <w:rPr>
+                <w:rFonts w:ascii="Franklin Gothic Book" w:hAnsi="Franklin Gothic Book"/>
+                <w:bCs/>
+              </w:rPr>
+              <w:t xml:space="preserve"> architecture</w:t>
+            </w:r>
+            <w:r>
+              <w:rPr>
+                <w:rFonts w:ascii="Franklin Gothic Book" w:hAnsi="Franklin Gothic Book"/>
+                <w:bCs/>
+              </w:rPr>
+              <w:t>), embeddings, vector search, prompt engineering, AI-assisted workflows</w:t>
             </w:r>
           </w:p>
         </w:tc>
@@ -1589,20 +1968,17 @@
               <w:jc w:val="center"/>
               <w:rPr>
                 <w:rFonts w:ascii="Franklin Gothic Book" w:hAnsi="Franklin Gothic Book"/>
+                <w:bCs/>
+                <w:spacing w:val="-2"/>
               </w:rPr>
             </w:pPr>
             <w:r>
               <w:rPr>
                 <w:rFonts w:ascii="Franklin Gothic Book" w:hAnsi="Franklin Gothic Book"/>
-              </w:rPr>
-              <w:t xml:space="preserve">GIS / </w:t>
-            </w:r>
-            <w:r>
-              <w:rPr>
-                <w:rFonts w:ascii="Franklin Gothic Book" w:hAnsi="Franklin Gothic Book"/>
+                <w:bCs/>
                 <w:spacing w:val="-2"/>
               </w:rPr>
-              <w:t>Geospatial</w:t>
+              <w:t>Data Analysis</w:t>
             </w:r>
           </w:p>
         </w:tc>
@@ -1617,28 +1993,47 @@
               <w:jc w:val="center"/>
               <w:rPr>
                 <w:rFonts w:ascii="Franklin Gothic Book" w:hAnsi="Franklin Gothic Book"/>
+                <w:bCs/>
+                <w:u w:val="single"/>
               </w:rPr>
             </w:pPr>
             <w:r>
               <w:rPr>
                 <w:rFonts w:ascii="Franklin Gothic Book" w:hAnsi="Franklin Gothic Book"/>
-              </w:rPr>
-              <w:t>GIS tools: QGIS, PostgreSQL/PostGIS, GDAL, rasterio, GeoPandas, Shapely, xarray, OpenDroneMap; spatial SQL, geospatial ETL</w:t>
-            </w:r>
-          </w:p>
-          <w:p>
-            <w:pPr>
-              <w:pStyle w:val="TableParagraph"/>
-              <w:jc w:val="center"/>
-              <w:rPr>
-                <w:rFonts w:ascii="Franklin Gothic Book" w:hAnsi="Franklin Gothic Book"/>
-              </w:rPr>
-            </w:pPr>
-            <w:r>
-              <w:rPr>
-                <w:rFonts w:ascii="Franklin Gothic Book" w:hAnsi="Franklin Gothic Book"/>
-              </w:rPr>
-              <w:t>ArcGIS Pro, ArcMap (ArcGIS Desktop), ArcGIS Online, ArcGIS Server, ArcPy, File Geodatabase, Enterprise Geodatabase, ArcGIS Feature Services, ArcGIS Map Services, ArcGIS Web Maps, ArcGIS REST API, ArcGIS Dashboards, ArcGIS Survey123 - Utilized extensively for geospatial analysis and mapping projects.</w:t>
+                <w:bCs/>
+              </w:rPr>
+              <w:t xml:space="preserve">Power BI, Excel/Power Query, Python (Pandas, NumPy), R, exploratory data analysis (EDA), </w:t>
+            </w:r>
+            <w:r>
+              <w:rPr>
+                <w:rFonts w:ascii="Franklin Gothic Book" w:hAnsi="Franklin Gothic Book"/>
+                <w:bCs/>
+                <w:u w:val="single"/>
+              </w:rPr>
+              <w:t>statistical</w:t>
+            </w:r>
+            <w:r>
+              <w:rPr>
+                <w:rFonts w:ascii="Franklin Gothic Book" w:hAnsi="Franklin Gothic Book"/>
+                <w:bCs/>
+              </w:rPr>
+              <w:t xml:space="preserve"> analysis, </w:t>
+            </w:r>
+            <w:proofErr w:type="spellStart"/>
+            <w:r>
+              <w:rPr>
+                <w:rFonts w:ascii="Franklin Gothic Book" w:hAnsi="Franklin Gothic Book"/>
+                <w:bCs/>
+              </w:rPr>
+              <w:t>Plotly</w:t>
+            </w:r>
+            <w:proofErr w:type="spellEnd"/>
+            <w:r>
+              <w:rPr>
+                <w:rFonts w:ascii="Franklin Gothic Book" w:hAnsi="Franklin Gothic Book"/>
+                <w:bCs/>
+              </w:rPr>
+              <w:t>, and Matplotlib</w:t>
             </w:r>
           </w:p>
         </w:tc>
@@ -1664,13 +2059,14 @@
               <w:rPr>
                 <w:rFonts w:ascii="Franklin Gothic Book" w:hAnsi="Franklin Gothic Book"/>
               </w:rPr>
-              <w:t>Spatial Modelling</w:t>
-            </w:r>
-            <w:r>
-              <w:rPr>
-                <w:rFonts w:ascii="Franklin Gothic Book" w:hAnsi="Franklin Gothic Book"/>
-              </w:rPr>
-              <w:t xml:space="preserve"> / Remote sensing</w:t>
+              <w:t xml:space="preserve">Data </w:t>
+            </w:r>
+            <w:r>
+              <w:rPr>
+                <w:rFonts w:ascii="Franklin Gothic Book" w:hAnsi="Franklin Gothic Book"/>
+                <w:spacing w:val="-2"/>
+              </w:rPr>
+              <w:t>Engineering</w:t>
             </w:r>
           </w:p>
         </w:tc>
@@ -1691,46 +2087,36 @@
               <w:rPr>
                 <w:rFonts w:ascii="Franklin Gothic Book" w:hAnsi="Franklin Gothic Book"/>
               </w:rPr>
-              <w:t>Spatial Modelling: Raster-based suitability and multicriteria modelling (</w:t>
+              <w:t xml:space="preserve">Python, SQL, PostgreSQL, </w:t>
             </w:r>
             <w:proofErr w:type="spellStart"/>
             <w:r>
               <w:rPr>
                 <w:rFonts w:ascii="Franklin Gothic Book" w:hAnsi="Franklin Gothic Book"/>
               </w:rPr>
-              <w:t>Saaty</w:t>
+              <w:t>DuckDB</w:t>
             </w:r>
             <w:proofErr w:type="spellEnd"/>
             <w:r>
               <w:rPr>
                 <w:rFonts w:ascii="Franklin Gothic Book" w:hAnsi="Franklin Gothic Book"/>
               </w:rPr>
-              <w:t xml:space="preserve"> AHP), terrain and hydrological analysis, spatial interpolation, density analysis, and raster algebra using ArcGIS Spatial Analyst and QGIS Processing.</w:t>
-            </w:r>
-          </w:p>
-          <w:p>
-            <w:pPr>
-              <w:pStyle w:val="TableParagraph"/>
-              <w:jc w:val="center"/>
-              <w:rPr>
-                <w:rFonts w:ascii="Franklin Gothic Book" w:hAnsi="Franklin Gothic Book"/>
-              </w:rPr>
-            </w:pPr>
-            <w:r>
-              <w:rPr>
-                <w:rFonts w:ascii="Franklin Gothic Book" w:hAnsi="Franklin Gothic Book"/>
-              </w:rPr>
-              <w:t>Remote Sensing: Optical and SAR image analysis, multitemporal change detection, spectral indices, classification, DEM processing, and high-resolution/drone imagery workflows using Sentinel-1/2, Landsat, ASTER, and Google Earth Engine.</w:t>
-            </w:r>
-          </w:p>
-          <w:p>
-            <w:pPr>
-              <w:pStyle w:val="TableParagraph"/>
-              <w:jc w:val="center"/>
-              <w:rPr>
-                <w:rFonts w:ascii="Franklin Gothic Book" w:hAnsi="Franklin Gothic Book"/>
-              </w:rPr>
-            </w:pPr>
+              <w:t xml:space="preserve">, Polars, Pandas, and </w:t>
+            </w:r>
+            <w:proofErr w:type="spellStart"/>
+            <w:r>
+              <w:rPr>
+                <w:rFonts w:ascii="Franklin Gothic Book" w:hAnsi="Franklin Gothic Book"/>
+              </w:rPr>
+              <w:t>SQLAlchemy</w:t>
+            </w:r>
+            <w:proofErr w:type="spellEnd"/>
+            <w:r>
+              <w:rPr>
+                <w:rFonts w:ascii="Franklin Gothic Book" w:hAnsi="Franklin Gothic Book"/>
+              </w:rPr>
+              <w:t xml:space="preserve"> for data validation, with expertise in ETL pipelines</w:t>
+            </w:r>
           </w:p>
         </w:tc>
       </w:tr>
@@ -1755,7 +2141,14 @@
               <w:rPr>
                 <w:rFonts w:ascii="Franklin Gothic Book" w:hAnsi="Franklin Gothic Book"/>
               </w:rPr>
-              <w:t>Workflow / Analytics Tools</w:t>
+              <w:t xml:space="preserve">GIS / </w:t>
+            </w:r>
+            <w:r>
+              <w:rPr>
+                <w:rFonts w:ascii="Franklin Gothic Book" w:hAnsi="Franklin Gothic Book"/>
+                <w:spacing w:val="-2"/>
+              </w:rPr>
+              <w:t>Geospatial</w:t>
             </w:r>
           </w:p>
         </w:tc>
@@ -1767,7 +2160,6 @@
           <w:p>
             <w:pPr>
               <w:pStyle w:val="TableParagraph"/>
-              <w:ind w:left="0"/>
               <w:jc w:val="center"/>
               <w:rPr>
                 <w:rFonts w:ascii="Franklin Gothic Book" w:hAnsi="Franklin Gothic Book"/>
@@ -1777,8 +2169,84 @@
               <w:rPr>
                 <w:rFonts w:ascii="Franklin Gothic Book" w:hAnsi="Franklin Gothic Book"/>
               </w:rPr>
-              <w:t>Airflow, Power Query, Power Apps, Plotly, Matplotlib (This revised text maintains the original list of tools, but removes filler words and first-person pronouns, and uses a more concise, professional style.)</w:t>
-            </w:r>
+              <w:t>QGIS, ArcGIS Pro</w:t>
+            </w:r>
+            <w:r>
+              <w:rPr>
+                <w:rFonts w:ascii="Franklin Gothic Book" w:hAnsi="Franklin Gothic Book"/>
+              </w:rPr>
+              <w:t xml:space="preserve"> (ArcMap, ArcGIS Web Maps, ArcGIS REST API, ArcGIS Dashboards, and ArcGIS Survey123)</w:t>
+            </w:r>
+            <w:r>
+              <w:rPr>
+                <w:rFonts w:ascii="Franklin Gothic Book" w:hAnsi="Franklin Gothic Book"/>
+              </w:rPr>
+              <w:t xml:space="preserve">, </w:t>
+            </w:r>
+            <w:proofErr w:type="spellStart"/>
+            <w:r>
+              <w:rPr>
+                <w:rFonts w:ascii="Franklin Gothic Book" w:hAnsi="Franklin Gothic Book"/>
+              </w:rPr>
+              <w:t>PostGIS</w:t>
+            </w:r>
+            <w:proofErr w:type="spellEnd"/>
+            <w:r>
+              <w:rPr>
+                <w:rFonts w:ascii="Franklin Gothic Book" w:hAnsi="Franklin Gothic Book"/>
+              </w:rPr>
+              <w:t xml:space="preserve">, GDAL, </w:t>
+            </w:r>
+            <w:proofErr w:type="spellStart"/>
+            <w:r>
+              <w:rPr>
+                <w:rFonts w:ascii="Franklin Gothic Book" w:hAnsi="Franklin Gothic Book"/>
+              </w:rPr>
+              <w:t>rasterio</w:t>
+            </w:r>
+            <w:proofErr w:type="spellEnd"/>
+            <w:r>
+              <w:rPr>
+                <w:rFonts w:ascii="Franklin Gothic Book" w:hAnsi="Franklin Gothic Book"/>
+              </w:rPr>
+              <w:t xml:space="preserve">, </w:t>
+            </w:r>
+            <w:proofErr w:type="spellStart"/>
+            <w:r>
+              <w:rPr>
+                <w:rFonts w:ascii="Franklin Gothic Book" w:hAnsi="Franklin Gothic Book"/>
+              </w:rPr>
+              <w:t>GeoPandas</w:t>
+            </w:r>
+            <w:proofErr w:type="spellEnd"/>
+            <w:r>
+              <w:rPr>
+                <w:rFonts w:ascii="Franklin Gothic Book" w:hAnsi="Franklin Gothic Book"/>
+              </w:rPr>
+              <w:t xml:space="preserve">, </w:t>
+            </w:r>
+            <w:proofErr w:type="spellStart"/>
+            <w:r>
+              <w:rPr>
+                <w:rFonts w:ascii="Franklin Gothic Book" w:hAnsi="Franklin Gothic Book"/>
+              </w:rPr>
+              <w:t>ArcPy</w:t>
+            </w:r>
+            <w:proofErr w:type="spellEnd"/>
+            <w:r>
+              <w:rPr>
+                <w:rFonts w:ascii="Franklin Gothic Book" w:hAnsi="Franklin Gothic Book"/>
+              </w:rPr>
+              <w:t xml:space="preserve">, </w:t>
+            </w:r>
+            <w:proofErr w:type="spellStart"/>
+            <w:r>
+              <w:rPr>
+                <w:rFonts w:ascii="Franklin Gothic Book" w:hAnsi="Franklin Gothic Book"/>
+              </w:rPr>
+              <w:t>GeoServer</w:t>
+            </w:r>
+            <w:proofErr w:type="spellEnd"/>
           </w:p>
         </w:tc>
       </w:tr>
@@ -1803,14 +2271,13 @@
               <w:rPr>
                 <w:rFonts w:ascii="Franklin Gothic Book" w:hAnsi="Franklin Gothic Book"/>
               </w:rPr>
-              <w:t xml:space="preserve">ML / Computer </w:t>
-            </w:r>
-            <w:r>
-              <w:rPr>
-                <w:rFonts w:ascii="Franklin Gothic Book" w:hAnsi="Franklin Gothic Book"/>
-                <w:spacing w:val="-2"/>
-              </w:rPr>
-              <w:t>Vision</w:t>
+              <w:t>Spatial Modelling</w:t>
+            </w:r>
+            <w:r>
+              <w:rPr>
+                <w:rFonts w:ascii="Franklin Gothic Book" w:hAnsi="Franklin Gothic Book"/>
+              </w:rPr>
+              <w:t xml:space="preserve"> / Remote sensing</w:t>
             </w:r>
           </w:p>
         </w:tc>
@@ -1831,49 +2298,7 @@
               <w:rPr>
                 <w:rFonts w:ascii="Franklin Gothic Book" w:hAnsi="Franklin Gothic Book"/>
               </w:rPr>
-              <w:t xml:space="preserve">Semantic segmentation, transfer learning, raster tiling, multiclass mask generation, data augmentation, class-imbalance handling, and pixel-level evaluation using </w:t>
-            </w:r>
-            <w:proofErr w:type="spellStart"/>
-            <w:r>
-              <w:rPr>
-                <w:rFonts w:ascii="Franklin Gothic Book" w:hAnsi="Franklin Gothic Book"/>
-              </w:rPr>
-              <w:t>IoU</w:t>
-            </w:r>
-            <w:proofErr w:type="spellEnd"/>
-            <w:r>
-              <w:rPr>
-                <w:rFonts w:ascii="Franklin Gothic Book" w:hAnsi="Franklin Gothic Book"/>
-              </w:rPr>
-              <w:t xml:space="preserve">, Dice coefficient, precision, recall, F1-score, and confusion matrices; proficient in </w:t>
-            </w:r>
-            <w:proofErr w:type="spellStart"/>
-            <w:r>
-              <w:rPr>
-                <w:rFonts w:ascii="Franklin Gothic Book" w:hAnsi="Franklin Gothic Book"/>
-              </w:rPr>
-              <w:t>PyTorch</w:t>
-            </w:r>
-            <w:proofErr w:type="spellEnd"/>
-            <w:r>
-              <w:rPr>
-                <w:rFonts w:ascii="Franklin Gothic Book" w:hAnsi="Franklin Gothic Book"/>
-              </w:rPr>
-              <w:t>, TensorFlow/</w:t>
-            </w:r>
-            <w:proofErr w:type="spellStart"/>
-            <w:r>
-              <w:rPr>
-                <w:rFonts w:ascii="Franklin Gothic Book" w:hAnsi="Franklin Gothic Book"/>
-              </w:rPr>
-              <w:t>Keras</w:t>
-            </w:r>
-            <w:proofErr w:type="spellEnd"/>
-            <w:r>
-              <w:rPr>
-                <w:rFonts w:ascii="Franklin Gothic Book" w:hAnsi="Franklin Gothic Book"/>
-              </w:rPr>
-              <w:t>, OpenCV, and scikit-image.</w:t>
+              <w:t>Spatial modelling, multicriteria analysis (AHP), terrain &amp; hydrological analysis, raster algebra, Sentinel-1/2, Landsat, ASTER, Google Earth Engine</w:t>
             </w:r>
           </w:p>
         </w:tc>
@@ -1893,22 +2318,13 @@
               <w:jc w:val="center"/>
               <w:rPr>
                 <w:rFonts w:ascii="Franklin Gothic Book" w:hAnsi="Franklin Gothic Book"/>
-                <w:spacing w:val="-2"/>
               </w:rPr>
             </w:pPr>
             <w:r>
               <w:rPr>
                 <w:rFonts w:ascii="Franklin Gothic Book" w:hAnsi="Franklin Gothic Book"/>
-                <w:spacing w:val="-2"/>
-              </w:rPr>
-              <w:t xml:space="preserve">Web GIS / </w:t>
-            </w:r>
-            <w:r>
-              <w:rPr>
-                <w:rFonts w:ascii="Franklin Gothic Book" w:hAnsi="Franklin Gothic Book"/>
-                <w:spacing w:val="-2"/>
-              </w:rPr>
-              <w:t>Development</w:t>
+              </w:rPr>
+              <w:t>Workflow / Analytics Tools</w:t>
             </w:r>
           </w:p>
         </w:tc>
@@ -1920,6 +2336,7 @@
           <w:p>
             <w:pPr>
               <w:pStyle w:val="TableParagraph"/>
+              <w:ind w:left="0"/>
               <w:jc w:val="center"/>
               <w:rPr>
                 <w:rFonts w:ascii="Franklin Gothic Book" w:hAnsi="Franklin Gothic Book"/>
@@ -1929,7 +2346,21 @@
               <w:rPr>
                 <w:rFonts w:ascii="Franklin Gothic Book" w:hAnsi="Franklin Gothic Book"/>
               </w:rPr>
-              <w:t xml:space="preserve">React, TypeScript, JavaScript, MapLibre GL JS, REST APIs, HTML, CSS, Git/GitHub, Docker, WSL/Linux </w:t>
+              <w:t xml:space="preserve">Airflow, Power Query, Power Apps, </w:t>
+            </w:r>
+            <w:proofErr w:type="spellStart"/>
+            <w:r>
+              <w:rPr>
+                <w:rFonts w:ascii="Franklin Gothic Book" w:hAnsi="Franklin Gothic Book"/>
+              </w:rPr>
+              <w:t>Plotly</w:t>
+            </w:r>
+            <w:proofErr w:type="spellEnd"/>
+            <w:r>
+              <w:rPr>
+                <w:rFonts w:ascii="Franklin Gothic Book" w:hAnsi="Franklin Gothic Book"/>
+              </w:rPr>
+              <w:t>, Matplotlib</w:t>
             </w:r>
           </w:p>
         </w:tc>
@@ -1949,15 +2380,20 @@
               <w:jc w:val="center"/>
               <w:rPr>
                 <w:rFonts w:ascii="Franklin Gothic Book" w:hAnsi="Franklin Gothic Book"/>
+              </w:rPr>
+            </w:pPr>
+            <w:r>
+              <w:rPr>
+                <w:rFonts w:ascii="Franklin Gothic Book" w:hAnsi="Franklin Gothic Book"/>
+              </w:rPr>
+              <w:t xml:space="preserve">ML / Computer </w:t>
+            </w:r>
+            <w:r>
+              <w:rPr>
+                <w:rFonts w:ascii="Franklin Gothic Book" w:hAnsi="Franklin Gothic Book"/>
                 <w:spacing w:val="-2"/>
               </w:rPr>
-            </w:pPr>
-            <w:r>
-              <w:rPr>
-                <w:rFonts w:ascii="Franklin Gothic Book" w:hAnsi="Franklin Gothic Book"/>
-                <w:spacing w:val="-2"/>
-              </w:rPr>
-              <w:t>Productivity and Collaboration</w:t>
+              <w:t>Vision</w:t>
             </w:r>
           </w:p>
         </w:tc>
@@ -1972,6 +2408,155 @@
               <w:jc w:val="center"/>
               <w:rPr>
                 <w:rFonts w:ascii="Franklin Gothic Book" w:hAnsi="Franklin Gothic Book"/>
+                <w:u w:val="single"/>
+              </w:rPr>
+            </w:pPr>
+            <w:proofErr w:type="spellStart"/>
+            <w:r>
+              <w:rPr>
+                <w:rFonts w:ascii="Franklin Gothic Book" w:hAnsi="Franklin Gothic Book"/>
+              </w:rPr>
+              <w:t>PyTorch</w:t>
+            </w:r>
+            <w:proofErr w:type="spellEnd"/>
+            <w:r>
+              <w:rPr>
+                <w:rFonts w:ascii="Franklin Gothic Book" w:hAnsi="Franklin Gothic Book"/>
+              </w:rPr>
+              <w:t>, TensorFlow/</w:t>
+            </w:r>
+            <w:proofErr w:type="spellStart"/>
+            <w:r>
+              <w:rPr>
+                <w:rFonts w:ascii="Franklin Gothic Book" w:hAnsi="Franklin Gothic Book"/>
+              </w:rPr>
+              <w:t>Keras</w:t>
+            </w:r>
+            <w:proofErr w:type="spellEnd"/>
+            <w:r>
+              <w:rPr>
+                <w:rFonts w:ascii="Franklin Gothic Book" w:hAnsi="Franklin Gothic Book"/>
+              </w:rPr>
+              <w:t xml:space="preserve">, OpenCV, and </w:t>
+            </w:r>
+            <w:r>
+              <w:rPr>
+                <w:rFonts w:ascii="Franklin Gothic Book" w:hAnsi="Franklin Gothic Book"/>
+                <w:bCs/>
+              </w:rPr>
+              <w:t>Sci-Kit Learn</w:t>
+            </w:r>
+          </w:p>
+        </w:tc>
+      </w:tr>
+      <w:tr>
+        <w:trPr>
+          <w:trHeight w:val="350"/>
+        </w:trPr>
+        <w:tc>
+          <w:tcPr>
+            <w:tcW w:w="2547" w:type="dxa"/>
+            <w:vAlign w:val="center"/>
+          </w:tcPr>
+          <w:p>
+            <w:pPr>
+              <w:pStyle w:val="TableParagraph"/>
+              <w:jc w:val="center"/>
+              <w:rPr>
+                <w:rFonts w:ascii="Franklin Gothic Book" w:hAnsi="Franklin Gothic Book"/>
+                <w:spacing w:val="-2"/>
+              </w:rPr>
+            </w:pPr>
+            <w:r>
+              <w:rPr>
+                <w:rFonts w:ascii="Franklin Gothic Book" w:hAnsi="Franklin Gothic Book"/>
+                <w:spacing w:val="-2"/>
+              </w:rPr>
+              <w:t xml:space="preserve">Web GIS / </w:t>
+            </w:r>
+            <w:r>
+              <w:rPr>
+                <w:rFonts w:ascii="Franklin Gothic Book" w:hAnsi="Franklin Gothic Book"/>
+                <w:spacing w:val="-2"/>
+              </w:rPr>
+              <w:t>Development</w:t>
+            </w:r>
+          </w:p>
+        </w:tc>
+        <w:tc>
+          <w:tcPr>
+            <w:tcW w:w="8221" w:type="dxa"/>
+            <w:vAlign w:val="center"/>
+          </w:tcPr>
+          <w:p>
+            <w:pPr>
+              <w:pStyle w:val="TableParagraph"/>
+              <w:jc w:val="center"/>
+              <w:rPr>
+                <w:rFonts w:ascii="Franklin Gothic Book" w:hAnsi="Franklin Gothic Book"/>
+              </w:rPr>
+            </w:pPr>
+            <w:r>
+              <w:rPr>
+                <w:rFonts w:ascii="Franklin Gothic Book" w:hAnsi="Franklin Gothic Book"/>
+              </w:rPr>
+              <w:t xml:space="preserve">React, TypeScript, JavaScript, </w:t>
+            </w:r>
+            <w:proofErr w:type="spellStart"/>
+            <w:r>
+              <w:rPr>
+                <w:rFonts w:ascii="Franklin Gothic Book" w:hAnsi="Franklin Gothic Book"/>
+              </w:rPr>
+              <w:t>MapLibre</w:t>
+            </w:r>
+            <w:proofErr w:type="spellEnd"/>
+            <w:r>
+              <w:rPr>
+                <w:rFonts w:ascii="Franklin Gothic Book" w:hAnsi="Franklin Gothic Book"/>
+              </w:rPr>
+              <w:t xml:space="preserve"> GL JS, REST APIs, HTML, CSS, Git/GitHub, Docker, WSL/Linux</w:t>
+            </w:r>
+          </w:p>
+        </w:tc>
+      </w:tr>
+      <w:tr>
+        <w:trPr>
+          <w:trHeight w:val="350"/>
+        </w:trPr>
+        <w:tc>
+          <w:tcPr>
+            <w:tcW w:w="2547" w:type="dxa"/>
+            <w:vAlign w:val="center"/>
+          </w:tcPr>
+          <w:p>
+            <w:pPr>
+              <w:pStyle w:val="TableParagraph"/>
+              <w:jc w:val="center"/>
+              <w:rPr>
+                <w:rFonts w:ascii="Franklin Gothic Book" w:hAnsi="Franklin Gothic Book"/>
+                <w:spacing w:val="-2"/>
+              </w:rPr>
+            </w:pPr>
+            <w:r>
+              <w:rPr>
+                <w:rFonts w:ascii="Franklin Gothic Book" w:hAnsi="Franklin Gothic Book"/>
+                <w:spacing w:val="-2"/>
+              </w:rPr>
+              <w:t>Productivity and Collaboration</w:t>
+            </w:r>
+          </w:p>
+        </w:tc>
+        <w:tc>
+          <w:tcPr>
+            <w:tcW w:w="8221" w:type="dxa"/>
+            <w:vAlign w:val="center"/>
+          </w:tcPr>
+          <w:p>
+            <w:pPr>
+              <w:pStyle w:val="TableParagraph"/>
+              <w:jc w:val="center"/>
+              <w:rPr>
+                <w:rFonts w:ascii="Franklin Gothic Book" w:hAnsi="Franklin Gothic Book"/>
               </w:rPr>
             </w:pPr>
             <w:r>
@@ -1995,6 +2580,7 @@
     <w:p>
       <w:pPr>
         <w:pStyle w:val="Ttulo1"/>
+        <w:ind w:left="0"/>
         <w:rPr>
           <w:rFonts w:ascii="Franklin Gothic Book" w:hAnsi="Franklin Gothic Book"/>
           <w:sz w:val="32"/>
@@ -2008,13 +2594,55 @@
           <w:sz w:val="32"/>
           <w:szCs w:val="32"/>
         </w:rPr>
+        <w:t>SOFT SKILLS</w:t>
+      </w:r>
+    </w:p>
+    <w:p>
+      <w:r>
+        <w:t xml:space="preserve">Analytical thinking, Critical thinking, Collaboration, </w:t>
+      </w:r>
+      <w:r>
+        <w:t xml:space="preserve">Effective communication, </w:t>
+      </w:r>
+      <w:r>
+        <w:t xml:space="preserve">Knowledge </w:t>
+      </w:r>
+      <w:r>
+        <w:t xml:space="preserve">sharing, </w:t>
+      </w:r>
+      <w:proofErr w:type="gramStart"/>
+      <w:r>
+        <w:t>Non-financial</w:t>
+      </w:r>
+      <w:proofErr w:type="gramEnd"/>
+      <w:r>
+        <w:t xml:space="preserve"> reporting</w:t>
+      </w:r>
+    </w:p>
+    <w:p/>
+    <w:p>
+      <w:pPr>
+        <w:pStyle w:val="Ttulo1"/>
+        <w:ind w:left="0"/>
+        <w:rPr>
+          <w:rFonts w:ascii="Franklin Gothic Book" w:hAnsi="Franklin Gothic Book"/>
+          <w:sz w:val="32"/>
+          <w:szCs w:val="32"/>
+        </w:rPr>
+      </w:pPr>
+      <w:r>
+        <w:rPr>
+          <w:rFonts w:ascii="Franklin Gothic Book" w:hAnsi="Franklin Gothic Book"/>
+          <w:spacing w:val="-2"/>
+          <w:sz w:val="32"/>
+          <w:szCs w:val="32"/>
+        </w:rPr>
         <w:t>EDUCATION &amp; CERTIFICATIONS</w:t>
       </w:r>
     </w:p>
     <w:p>
       <w:pPr>
         <w:spacing w:before="10" w:after="60"/>
-        <w:ind w:left="200"/>
         <w:rPr>
           <w:rFonts w:ascii="Franklin Gothic Book" w:hAnsi="Franklin Gothic Book"/>
           <w:szCs w:val="24"/>
@@ -2047,7 +2675,6 @@
     <w:p>
       <w:pPr>
         <w:spacing w:before="10" w:after="60"/>
-        <w:ind w:left="200"/>
         <w:rPr>
           <w:rFonts w:ascii="Franklin Gothic Book" w:hAnsi="Franklin Gothic Book"/>
           <w:szCs w:val="24"/>
@@ -2088,7 +2715,7 @@
           <w:tab w:val="left" w:pos="325"/>
         </w:tabs>
         <w:spacing w:after="60"/>
-        <w:ind w:left="325" w:hanging="125"/>
+        <w:ind w:left="125" w:hanging="125"/>
         <w:rPr>
           <w:rFonts w:ascii="Franklin Gothic Book" w:hAnsi="Franklin Gothic Book"/>
           <w:szCs w:val="24"/>
@@ -2113,7 +2740,7 @@
           <w:tab w:val="left" w:pos="325"/>
         </w:tabs>
         <w:spacing w:after="60"/>
-        <w:ind w:left="325" w:hanging="125"/>
+        <w:ind w:left="125" w:hanging="125"/>
         <w:rPr>
           <w:rFonts w:ascii="Franklin Gothic Book" w:hAnsi="Franklin Gothic Book"/>
           <w:szCs w:val="24"/>
@@ -2176,7 +2803,7 @@
           <w:tab w:val="left" w:pos="325"/>
         </w:tabs>
         <w:spacing w:after="60"/>
-        <w:ind w:left="325" w:hanging="125"/>
+        <w:ind w:left="125" w:hanging="125"/>
         <w:rPr>
           <w:rFonts w:ascii="Franklin Gothic Book" w:hAnsi="Franklin Gothic Book"/>
           <w:szCs w:val="24"/>
@@ -2205,6 +2832,7 @@
     <w:p>
       <w:pPr>
         <w:pStyle w:val="Ttulo1"/>
+        <w:ind w:left="0"/>
         <w:rPr>
           <w:rFonts w:ascii="Franklin Gothic Book" w:hAnsi="Franklin Gothic Book"/>
           <w:sz w:val="32"/>
@@ -2232,6 +2860,7 @@
     <w:p>
       <w:pPr>
         <w:pStyle w:val="Bullet"/>
+        <w:ind w:left="123"/>
       </w:pPr>
       <w:r>
         <w:t xml:space="preserve">Founder &amp; Project Lead — </w:t>
@@ -2254,6 +2883,7 @@
     <w:p>
       <w:pPr>
         <w:pStyle w:val="Bullet"/>
+        <w:ind w:left="123"/>
       </w:pPr>
       <w:r>
         <w:t xml:space="preserve">President - Environmental Geography Student Society (UAQ) </w:t>
@@ -2265,9 +2895,19 @@
     <w:p>
       <w:pPr>
         <w:pStyle w:val="Bullet"/>
-      </w:pPr>
-      <w:r>
-        <w:t xml:space="preserve">Geography Students' National Meeting Organizing Committee Member </w:t>
+        <w:ind w:left="123"/>
+      </w:pPr>
+      <w:r>
+        <w:t xml:space="preserve">Geography Students' National Meeting Organizing Committee </w:t>
+      </w:r>
+      <w:r>
+        <w:rPr>
+          <w:u w:val="single"/>
+        </w:rPr>
+        <w:t>Member</w:t>
+      </w:r>
+      <w:r>
+        <w:t xml:space="preserve"> </w:t>
       </w:r>
       <w:r>
         <w:t>(2017)</w:t>
@@ -2968,6 +3608,7 @@
   <w:style w:type="character" w:default="1" w:styleId="Fuentedeprrafopredeter">
     <w:name w:val="Default Paragraph Font"/>
     <w:uiPriority w:val="1"/>
+    <w:semiHidden/>
     <w:unhideWhenUsed/>
   </w:style>
   <w:style w:type="table" w:default="1" w:styleId="Tablanormal">

</xml_diff>